<commit_message>
changes made by claude
</commit_message>
<xml_diff>
--- a/styles/flexup_template.docx
+++ b/styles/flexup_template.docx
@@ -6037,6 +6037,19 @@
       <w:ind w:left="567"/>
     </w:pPr>
   </w:style>
+  <w:style w:type="paragraph" w:styleId="Index1">
+    <w:name w:val="index 1"/>
+    <w:basedOn w:val="Normal"/>
+    <w:next w:val="Normal"/>
+    <w:autoRedefine/>
+    <w:uiPriority w:val="99"/>
+    <w:semiHidden/>
+    <w:unhideWhenUsed/>
+    <w:pPr>
+      <w:spacing w:before="0" w:after="0" w:line="240" w:lineRule="auto"/>
+      <w:ind w:left="200" w:hanging="200"/>
+    </w:pPr>
+  </w:style>
 </w:styles>
 </file>
 

</xml_diff>

<commit_message>
added list comment to style template
</commit_message>
<xml_diff>
--- a/styles/flexup_template.docx
+++ b/styles/flexup_template.docx
@@ -1,6 +1,6 @@
 
 <file path=word/document.xml><?xml version="1.0" encoding="utf-8"?>
-<w:document xmlns:wpc="http://schemas.microsoft.com/office/word/2010/wordprocessingCanvas" xmlns:cx="http://schemas.microsoft.com/office/drawing/2014/chartex" xmlns:cx1="http://schemas.microsoft.com/office/drawing/2015/9/8/chartex" xmlns:cx2="http://schemas.microsoft.com/office/drawing/2015/10/21/chartex" xmlns:cx3="http://schemas.microsoft.com/office/drawing/2016/5/9/chartex" xmlns:cx4="http://schemas.microsoft.com/office/drawing/2016/5/10/chartex" xmlns:cx5="http://schemas.microsoft.com/office/drawing/2016/5/11/chartex" xmlns:cx6="http://schemas.microsoft.com/office/drawing/2016/5/12/chartex" xmlns:cx7="http://schemas.microsoft.com/office/drawing/2016/5/13/chartex" xmlns:cx8="http://schemas.microsoft.com/office/drawing/2016/5/14/chartex" xmlns:mc="http://schemas.openxmlformats.org/markup-compatibility/2006" xmlns:aink="http://schemas.microsoft.com/office/drawing/2016/ink" xmlns:am3d="http://schemas.microsoft.com/office/drawing/2017/model3d" xmlns:o="urn:schemas-microsoft-com:office:office" xmlns:oel="http://schemas.microsoft.com/office/2019/extlst" xmlns:r="http://schemas.openxmlformats.org/officeDocument/2006/relationships" xmlns:m="http://schemas.openxmlformats.org/officeDocument/2006/math" xmlns:v="urn:schemas-microsoft-com:vml" xmlns:wp14="http://schemas.microsoft.com/office/word/2010/wordprocessingDrawing" xmlns:wp="http://schemas.openxmlformats.org/drawingml/2006/wordprocessingDrawing" xmlns:w10="urn:schemas-microsoft-com:office:word" xmlns:w="http://schemas.openxmlformats.org/wordprocessingml/2006/main" xmlns:w14="http://schemas.microsoft.com/office/word/2010/wordml" xmlns:w15="http://schemas.microsoft.com/office/word/2012/wordml" xmlns:w16cex="http://schemas.microsoft.com/office/word/2018/wordml/cex" xmlns:w16cid="http://schemas.microsoft.com/office/word/2016/wordml/cid" xmlns:w16="http://schemas.microsoft.com/office/word/2018/wordml" xmlns:w16du="http://schemas.microsoft.com/office/word/2023/wordml/word16du" xmlns:w16sdtdh="http://schemas.microsoft.com/office/word/2020/wordml/sdtdatahash" xmlns:w16sdtfl="http://schemas.microsoft.com/office/word/2024/wordml/sdtformatlock" xmlns:w16se="http://schemas.microsoft.com/office/word/2015/wordml/symex" xmlns:wpg="http://schemas.microsoft.com/office/word/2010/wordprocessingGroup" xmlns:wpi="http://schemas.microsoft.com/office/word/2010/wordprocessingInk" xmlns:wne="http://schemas.microsoft.com/office/word/2006/wordml" xmlns:wps="http://schemas.microsoft.com/office/word/2010/wordprocessingShape" mc:Ignorable="w14 w15 w16se w16cid w16 w16cex w16sdtdh w16sdtfl w16du wp14">
+<w:document xmlns:wpc="http://schemas.microsoft.com/office/word/2010/wordprocessingCanvas" xmlns:cx="http://schemas.microsoft.com/office/drawing/2014/chartex" xmlns:cx1="http://schemas.microsoft.com/office/drawing/2015/9/8/chartex" xmlns:cx2="http://schemas.microsoft.com/office/drawing/2015/10/21/chartex" xmlns:cx3="http://schemas.microsoft.com/office/drawing/2016/5/9/chartex" xmlns:cx4="http://schemas.microsoft.com/office/drawing/2016/5/10/chartex" xmlns:cx5="http://schemas.microsoft.com/office/drawing/2016/5/11/chartex" xmlns:cx6="http://schemas.microsoft.com/office/drawing/2016/5/12/chartex" xmlns:cx7="http://schemas.microsoft.com/office/drawing/2016/5/13/chartex" xmlns:cx8="http://schemas.microsoft.com/office/drawing/2016/5/14/chartex" xmlns:mc="http://schemas.openxmlformats.org/markup-compatibility/2006" xmlns:aink="http://schemas.microsoft.com/office/drawing/2016/ink" xmlns:am3d="http://schemas.microsoft.com/office/drawing/2017/model3d" xmlns:o="urn:schemas-microsoft-com:office:office" xmlns:oel="http://schemas.microsoft.com/office/2019/extlst" xmlns:r="http://schemas.openxmlformats.org/officeDocument/2006/relationships" xmlns:m="http://schemas.openxmlformats.org/officeDocument/2006/math" xmlns:v="urn:schemas-microsoft-com:vml" xmlns:wp14="http://schemas.microsoft.com/office/word/2010/wordprocessingDrawing" xmlns:wp="http://schemas.openxmlformats.org/drawingml/2006/wordprocessingDrawing" xmlns:w10="urn:schemas-microsoft-com:office:word" xmlns:w="http://schemas.openxmlformats.org/wordprocessingml/2006/main" xmlns:w14="http://schemas.microsoft.com/office/word/2010/wordml" xmlns:w15="http://schemas.microsoft.com/office/word/2012/wordml" xmlns:w16cei="http://schemas.microsoft.com/office/word/2026/wordml/cei" xmlns:w16cex="http://schemas.microsoft.com/office/word/2018/wordml/cex" xmlns:w16cid="http://schemas.microsoft.com/office/word/2016/wordml/cid" xmlns:w16="http://schemas.microsoft.com/office/word/2018/wordml" xmlns:w16du="http://schemas.microsoft.com/office/word/2023/wordml/word16du" xmlns:w16sdtdh="http://schemas.microsoft.com/office/word/2020/wordml/sdtdatahash" xmlns:w16sdtfl="http://schemas.microsoft.com/office/word/2024/wordml/sdtformatlock" xmlns:w16se="http://schemas.microsoft.com/office/word/2015/wordml/symex" xmlns:wpg="http://schemas.microsoft.com/office/word/2010/wordprocessingGroup" xmlns:wpi="http://schemas.microsoft.com/office/word/2010/wordprocessingInk" xmlns:wne="http://schemas.microsoft.com/office/word/2006/wordml" xmlns:wps="http://schemas.microsoft.com/office/word/2010/wordprocessingShape" mc:Ignorable="w14 w15 w16se w16cid w16 w16cex w16sdtdh w16sdtfl w16du wp14">
   <w:body>
     <w:p>
       <w:pPr>
@@ -32,6 +32,20 @@
       </w:pPr>
       <w:r>
         <w:t>Comments</w:t>
+      </w:r>
+    </w:p>
+    <w:p>
+      <w:pPr>
+        <w:pStyle w:val="CommentsList"/>
+        <w:rPr>
+          <w:color w:val="A6A6A6" w:themeColor="background1" w:themeShade="A6"/>
+        </w:rPr>
+      </w:pPr>
+      <w:r>
+        <w:rPr>
+          <w:color w:val="A6A6A6" w:themeColor="background1" w:themeShade="A6"/>
+        </w:rPr>
+        <w:t>Comments List</w:t>
       </w:r>
     </w:p>
     <w:p>
@@ -1055,7 +1069,7 @@
 </file>
 
 <file path=word/endnotes.xml><?xml version="1.0" encoding="utf-8"?>
-<w:endnotes xmlns:wpc="http://schemas.microsoft.com/office/word/2010/wordprocessingCanvas" xmlns:cx="http://schemas.microsoft.com/office/drawing/2014/chartex" xmlns:cx1="http://schemas.microsoft.com/office/drawing/2015/9/8/chartex" xmlns:cx2="http://schemas.microsoft.com/office/drawing/2015/10/21/chartex" xmlns:cx3="http://schemas.microsoft.com/office/drawing/2016/5/9/chartex" xmlns:cx4="http://schemas.microsoft.com/office/drawing/2016/5/10/chartex" xmlns:cx5="http://schemas.microsoft.com/office/drawing/2016/5/11/chartex" xmlns:cx6="http://schemas.microsoft.com/office/drawing/2016/5/12/chartex" xmlns:cx7="http://schemas.microsoft.com/office/drawing/2016/5/13/chartex" xmlns:cx8="http://schemas.microsoft.com/office/drawing/2016/5/14/chartex" xmlns:mc="http://schemas.openxmlformats.org/markup-compatibility/2006" xmlns:aink="http://schemas.microsoft.com/office/drawing/2016/ink" xmlns:am3d="http://schemas.microsoft.com/office/drawing/2017/model3d" xmlns:o="urn:schemas-microsoft-com:office:office" xmlns:oel="http://schemas.microsoft.com/office/2019/extlst" xmlns:r="http://schemas.openxmlformats.org/officeDocument/2006/relationships" xmlns:m="http://schemas.openxmlformats.org/officeDocument/2006/math" xmlns:v="urn:schemas-microsoft-com:vml" xmlns:wp14="http://schemas.microsoft.com/office/word/2010/wordprocessingDrawing" xmlns:wp="http://schemas.openxmlformats.org/drawingml/2006/wordprocessingDrawing" xmlns:w10="urn:schemas-microsoft-com:office:word" xmlns:w="http://schemas.openxmlformats.org/wordprocessingml/2006/main" xmlns:w14="http://schemas.microsoft.com/office/word/2010/wordml" xmlns:w15="http://schemas.microsoft.com/office/word/2012/wordml" xmlns:w16cex="http://schemas.microsoft.com/office/word/2018/wordml/cex" xmlns:w16cid="http://schemas.microsoft.com/office/word/2016/wordml/cid" xmlns:w16="http://schemas.microsoft.com/office/word/2018/wordml" xmlns:w16du="http://schemas.microsoft.com/office/word/2023/wordml/word16du" xmlns:w16sdtdh="http://schemas.microsoft.com/office/word/2020/wordml/sdtdatahash" xmlns:w16sdtfl="http://schemas.microsoft.com/office/word/2024/wordml/sdtformatlock" xmlns:w16se="http://schemas.microsoft.com/office/word/2015/wordml/symex" xmlns:wpg="http://schemas.microsoft.com/office/word/2010/wordprocessingGroup" xmlns:wpi="http://schemas.microsoft.com/office/word/2010/wordprocessingInk" xmlns:wne="http://schemas.microsoft.com/office/word/2006/wordml" xmlns:wps="http://schemas.microsoft.com/office/word/2010/wordprocessingShape" mc:Ignorable="w14 w15 w16se w16cid w16 w16cex w16sdtdh w16sdtfl w16du wp14">
+<w:endnotes xmlns:wpc="http://schemas.microsoft.com/office/word/2010/wordprocessingCanvas" xmlns:cx="http://schemas.microsoft.com/office/drawing/2014/chartex" xmlns:cx1="http://schemas.microsoft.com/office/drawing/2015/9/8/chartex" xmlns:cx2="http://schemas.microsoft.com/office/drawing/2015/10/21/chartex" xmlns:cx3="http://schemas.microsoft.com/office/drawing/2016/5/9/chartex" xmlns:cx4="http://schemas.microsoft.com/office/drawing/2016/5/10/chartex" xmlns:cx5="http://schemas.microsoft.com/office/drawing/2016/5/11/chartex" xmlns:cx6="http://schemas.microsoft.com/office/drawing/2016/5/12/chartex" xmlns:cx7="http://schemas.microsoft.com/office/drawing/2016/5/13/chartex" xmlns:cx8="http://schemas.microsoft.com/office/drawing/2016/5/14/chartex" xmlns:mc="http://schemas.openxmlformats.org/markup-compatibility/2006" xmlns:aink="http://schemas.microsoft.com/office/drawing/2016/ink" xmlns:am3d="http://schemas.microsoft.com/office/drawing/2017/model3d" xmlns:o="urn:schemas-microsoft-com:office:office" xmlns:oel="http://schemas.microsoft.com/office/2019/extlst" xmlns:r="http://schemas.openxmlformats.org/officeDocument/2006/relationships" xmlns:m="http://schemas.openxmlformats.org/officeDocument/2006/math" xmlns:v="urn:schemas-microsoft-com:vml" xmlns:wp14="http://schemas.microsoft.com/office/word/2010/wordprocessingDrawing" xmlns:wp="http://schemas.openxmlformats.org/drawingml/2006/wordprocessingDrawing" xmlns:w10="urn:schemas-microsoft-com:office:word" xmlns:w="http://schemas.openxmlformats.org/wordprocessingml/2006/main" xmlns:w14="http://schemas.microsoft.com/office/word/2010/wordml" xmlns:w15="http://schemas.microsoft.com/office/word/2012/wordml" xmlns:w16cei="http://schemas.microsoft.com/office/word/2026/wordml/cei" xmlns:w16cex="http://schemas.microsoft.com/office/word/2018/wordml/cex" xmlns:w16cid="http://schemas.microsoft.com/office/word/2016/wordml/cid" xmlns:w16="http://schemas.microsoft.com/office/word/2018/wordml" xmlns:w16du="http://schemas.microsoft.com/office/word/2023/wordml/word16du" xmlns:w16sdtdh="http://schemas.microsoft.com/office/word/2020/wordml/sdtdatahash" xmlns:w16sdtfl="http://schemas.microsoft.com/office/word/2024/wordml/sdtformatlock" xmlns:w16se="http://schemas.microsoft.com/office/word/2015/wordml/symex" xmlns:wpg="http://schemas.microsoft.com/office/word/2010/wordprocessingGroup" xmlns:wpi="http://schemas.microsoft.com/office/word/2010/wordprocessingInk" xmlns:wne="http://schemas.microsoft.com/office/word/2006/wordml" xmlns:wps="http://schemas.microsoft.com/office/word/2010/wordprocessingShape" mc:Ignorable="w14 w15 w16se w16cid w16 w16cex w16sdtdh w16sdtfl w16du wp14">
   <w:endnote w:type="separator" w:id="-1">
     <w:p>
       <w:r>
@@ -1102,7 +1116,7 @@
 </file>
 
 <file path=word/footer1.xml><?xml version="1.0" encoding="utf-8"?>
-<w:ftr xmlns:wpc="http://schemas.microsoft.com/office/word/2010/wordprocessingCanvas" xmlns:cx="http://schemas.microsoft.com/office/drawing/2014/chartex" xmlns:cx1="http://schemas.microsoft.com/office/drawing/2015/9/8/chartex" xmlns:cx2="http://schemas.microsoft.com/office/drawing/2015/10/21/chartex" xmlns:cx3="http://schemas.microsoft.com/office/drawing/2016/5/9/chartex" xmlns:cx4="http://schemas.microsoft.com/office/drawing/2016/5/10/chartex" xmlns:cx5="http://schemas.microsoft.com/office/drawing/2016/5/11/chartex" xmlns:cx6="http://schemas.microsoft.com/office/drawing/2016/5/12/chartex" xmlns:cx7="http://schemas.microsoft.com/office/drawing/2016/5/13/chartex" xmlns:cx8="http://schemas.microsoft.com/office/drawing/2016/5/14/chartex" xmlns:mc="http://schemas.openxmlformats.org/markup-compatibility/2006" xmlns:aink="http://schemas.microsoft.com/office/drawing/2016/ink" xmlns:am3d="http://schemas.microsoft.com/office/drawing/2017/model3d" xmlns:o="urn:schemas-microsoft-com:office:office" xmlns:oel="http://schemas.microsoft.com/office/2019/extlst" xmlns:r="http://schemas.openxmlformats.org/officeDocument/2006/relationships" xmlns:m="http://schemas.openxmlformats.org/officeDocument/2006/math" xmlns:v="urn:schemas-microsoft-com:vml" xmlns:wp14="http://schemas.microsoft.com/office/word/2010/wordprocessingDrawing" xmlns:wp="http://schemas.openxmlformats.org/drawingml/2006/wordprocessingDrawing" xmlns:w10="urn:schemas-microsoft-com:office:word" xmlns:w="http://schemas.openxmlformats.org/wordprocessingml/2006/main" xmlns:w14="http://schemas.microsoft.com/office/word/2010/wordml" xmlns:w15="http://schemas.microsoft.com/office/word/2012/wordml" xmlns:w16cex="http://schemas.microsoft.com/office/word/2018/wordml/cex" xmlns:w16cid="http://schemas.microsoft.com/office/word/2016/wordml/cid" xmlns:w16="http://schemas.microsoft.com/office/word/2018/wordml" xmlns:w16du="http://schemas.microsoft.com/office/word/2023/wordml/word16du" xmlns:w16sdtdh="http://schemas.microsoft.com/office/word/2020/wordml/sdtdatahash" xmlns:w16sdtfl="http://schemas.microsoft.com/office/word/2024/wordml/sdtformatlock" xmlns:w16se="http://schemas.microsoft.com/office/word/2015/wordml/symex" xmlns:wpg="http://schemas.microsoft.com/office/word/2010/wordprocessingGroup" xmlns:wpi="http://schemas.microsoft.com/office/word/2010/wordprocessingInk" xmlns:wne="http://schemas.microsoft.com/office/word/2006/wordml" xmlns:wps="http://schemas.microsoft.com/office/word/2010/wordprocessingShape" mc:Ignorable="w14 w15 w16se w16cid w16 w16cex w16sdtdh w16sdtfl w16du wp14">
+<w:ftr xmlns:wpc="http://schemas.microsoft.com/office/word/2010/wordprocessingCanvas" xmlns:cx="http://schemas.microsoft.com/office/drawing/2014/chartex" xmlns:cx1="http://schemas.microsoft.com/office/drawing/2015/9/8/chartex" xmlns:cx2="http://schemas.microsoft.com/office/drawing/2015/10/21/chartex" xmlns:cx3="http://schemas.microsoft.com/office/drawing/2016/5/9/chartex" xmlns:cx4="http://schemas.microsoft.com/office/drawing/2016/5/10/chartex" xmlns:cx5="http://schemas.microsoft.com/office/drawing/2016/5/11/chartex" xmlns:cx6="http://schemas.microsoft.com/office/drawing/2016/5/12/chartex" xmlns:cx7="http://schemas.microsoft.com/office/drawing/2016/5/13/chartex" xmlns:cx8="http://schemas.microsoft.com/office/drawing/2016/5/14/chartex" xmlns:mc="http://schemas.openxmlformats.org/markup-compatibility/2006" xmlns:aink="http://schemas.microsoft.com/office/drawing/2016/ink" xmlns:am3d="http://schemas.microsoft.com/office/drawing/2017/model3d" xmlns:o="urn:schemas-microsoft-com:office:office" xmlns:oel="http://schemas.microsoft.com/office/2019/extlst" xmlns:r="http://schemas.openxmlformats.org/officeDocument/2006/relationships" xmlns:m="http://schemas.openxmlformats.org/officeDocument/2006/math" xmlns:v="urn:schemas-microsoft-com:vml" xmlns:wp14="http://schemas.microsoft.com/office/word/2010/wordprocessingDrawing" xmlns:wp="http://schemas.openxmlformats.org/drawingml/2006/wordprocessingDrawing" xmlns:w10="urn:schemas-microsoft-com:office:word" xmlns:w="http://schemas.openxmlformats.org/wordprocessingml/2006/main" xmlns:w14="http://schemas.microsoft.com/office/word/2010/wordml" xmlns:w15="http://schemas.microsoft.com/office/word/2012/wordml" xmlns:w16cei="http://schemas.microsoft.com/office/word/2026/wordml/cei" xmlns:w16cex="http://schemas.microsoft.com/office/word/2018/wordml/cex" xmlns:w16cid="http://schemas.microsoft.com/office/word/2016/wordml/cid" xmlns:w16="http://schemas.microsoft.com/office/word/2018/wordml" xmlns:w16du="http://schemas.microsoft.com/office/word/2023/wordml/word16du" xmlns:w16sdtdh="http://schemas.microsoft.com/office/word/2020/wordml/sdtdatahash" xmlns:w16sdtfl="http://schemas.microsoft.com/office/word/2024/wordml/sdtformatlock" xmlns:w16se="http://schemas.microsoft.com/office/word/2015/wordml/symex" xmlns:wpg="http://schemas.microsoft.com/office/word/2010/wordprocessingGroup" xmlns:wpi="http://schemas.microsoft.com/office/word/2010/wordprocessingInk" xmlns:wne="http://schemas.microsoft.com/office/word/2006/wordml" xmlns:wps="http://schemas.microsoft.com/office/word/2010/wordprocessingShape" mc:Ignorable="w14 w15 w16se w16cid w16 w16cex w16sdtdh w16sdtfl w16du wp14">
   <w:p>
     <w:pPr>
       <w:pStyle w:val="Footer"/>
@@ -1159,7 +1173,7 @@
 </file>
 
 <file path=word/footnotes.xml><?xml version="1.0" encoding="utf-8"?>
-<w:footnotes xmlns:wpc="http://schemas.microsoft.com/office/word/2010/wordprocessingCanvas" xmlns:cx="http://schemas.microsoft.com/office/drawing/2014/chartex" xmlns:cx1="http://schemas.microsoft.com/office/drawing/2015/9/8/chartex" xmlns:cx2="http://schemas.microsoft.com/office/drawing/2015/10/21/chartex" xmlns:cx3="http://schemas.microsoft.com/office/drawing/2016/5/9/chartex" xmlns:cx4="http://schemas.microsoft.com/office/drawing/2016/5/10/chartex" xmlns:cx5="http://schemas.microsoft.com/office/drawing/2016/5/11/chartex" xmlns:cx6="http://schemas.microsoft.com/office/drawing/2016/5/12/chartex" xmlns:cx7="http://schemas.microsoft.com/office/drawing/2016/5/13/chartex" xmlns:cx8="http://schemas.microsoft.com/office/drawing/2016/5/14/chartex" xmlns:mc="http://schemas.openxmlformats.org/markup-compatibility/2006" xmlns:aink="http://schemas.microsoft.com/office/drawing/2016/ink" xmlns:am3d="http://schemas.microsoft.com/office/drawing/2017/model3d" xmlns:o="urn:schemas-microsoft-com:office:office" xmlns:oel="http://schemas.microsoft.com/office/2019/extlst" xmlns:r="http://schemas.openxmlformats.org/officeDocument/2006/relationships" xmlns:m="http://schemas.openxmlformats.org/officeDocument/2006/math" xmlns:v="urn:schemas-microsoft-com:vml" xmlns:wp14="http://schemas.microsoft.com/office/word/2010/wordprocessingDrawing" xmlns:wp="http://schemas.openxmlformats.org/drawingml/2006/wordprocessingDrawing" xmlns:w10="urn:schemas-microsoft-com:office:word" xmlns:w="http://schemas.openxmlformats.org/wordprocessingml/2006/main" xmlns:w14="http://schemas.microsoft.com/office/word/2010/wordml" xmlns:w15="http://schemas.microsoft.com/office/word/2012/wordml" xmlns:w16cex="http://schemas.microsoft.com/office/word/2018/wordml/cex" xmlns:w16cid="http://schemas.microsoft.com/office/word/2016/wordml/cid" xmlns:w16="http://schemas.microsoft.com/office/word/2018/wordml" xmlns:w16du="http://schemas.microsoft.com/office/word/2023/wordml/word16du" xmlns:w16sdtdh="http://schemas.microsoft.com/office/word/2020/wordml/sdtdatahash" xmlns:w16sdtfl="http://schemas.microsoft.com/office/word/2024/wordml/sdtformatlock" xmlns:w16se="http://schemas.microsoft.com/office/word/2015/wordml/symex" xmlns:wpg="http://schemas.microsoft.com/office/word/2010/wordprocessingGroup" xmlns:wpi="http://schemas.microsoft.com/office/word/2010/wordprocessingInk" xmlns:wne="http://schemas.microsoft.com/office/word/2006/wordml" xmlns:wps="http://schemas.microsoft.com/office/word/2010/wordprocessingShape" mc:Ignorable="w14 w15 w16se w16cid w16 w16cex w16sdtdh w16sdtfl w16du wp14">
+<w:footnotes xmlns:wpc="http://schemas.microsoft.com/office/word/2010/wordprocessingCanvas" xmlns:cx="http://schemas.microsoft.com/office/drawing/2014/chartex" xmlns:cx1="http://schemas.microsoft.com/office/drawing/2015/9/8/chartex" xmlns:cx2="http://schemas.microsoft.com/office/drawing/2015/10/21/chartex" xmlns:cx3="http://schemas.microsoft.com/office/drawing/2016/5/9/chartex" xmlns:cx4="http://schemas.microsoft.com/office/drawing/2016/5/10/chartex" xmlns:cx5="http://schemas.microsoft.com/office/drawing/2016/5/11/chartex" xmlns:cx6="http://schemas.microsoft.com/office/drawing/2016/5/12/chartex" xmlns:cx7="http://schemas.microsoft.com/office/drawing/2016/5/13/chartex" xmlns:cx8="http://schemas.microsoft.com/office/drawing/2016/5/14/chartex" xmlns:mc="http://schemas.openxmlformats.org/markup-compatibility/2006" xmlns:aink="http://schemas.microsoft.com/office/drawing/2016/ink" xmlns:am3d="http://schemas.microsoft.com/office/drawing/2017/model3d" xmlns:o="urn:schemas-microsoft-com:office:office" xmlns:oel="http://schemas.microsoft.com/office/2019/extlst" xmlns:r="http://schemas.openxmlformats.org/officeDocument/2006/relationships" xmlns:m="http://schemas.openxmlformats.org/officeDocument/2006/math" xmlns:v="urn:schemas-microsoft-com:vml" xmlns:wp14="http://schemas.microsoft.com/office/word/2010/wordprocessingDrawing" xmlns:wp="http://schemas.openxmlformats.org/drawingml/2006/wordprocessingDrawing" xmlns:w10="urn:schemas-microsoft-com:office:word" xmlns:w="http://schemas.openxmlformats.org/wordprocessingml/2006/main" xmlns:w14="http://schemas.microsoft.com/office/word/2010/wordml" xmlns:w15="http://schemas.microsoft.com/office/word/2012/wordml" xmlns:w16cei="http://schemas.microsoft.com/office/word/2026/wordml/cei" xmlns:w16cex="http://schemas.microsoft.com/office/word/2018/wordml/cex" xmlns:w16cid="http://schemas.microsoft.com/office/word/2016/wordml/cid" xmlns:w16="http://schemas.microsoft.com/office/word/2018/wordml" xmlns:w16du="http://schemas.microsoft.com/office/word/2023/wordml/word16du" xmlns:w16sdtdh="http://schemas.microsoft.com/office/word/2020/wordml/sdtdatahash" xmlns:w16sdtfl="http://schemas.microsoft.com/office/word/2024/wordml/sdtformatlock" xmlns:w16se="http://schemas.microsoft.com/office/word/2015/wordml/symex" xmlns:wpg="http://schemas.microsoft.com/office/word/2010/wordprocessingGroup" xmlns:wpi="http://schemas.microsoft.com/office/word/2010/wordprocessingInk" xmlns:wne="http://schemas.microsoft.com/office/word/2006/wordml" xmlns:wps="http://schemas.microsoft.com/office/word/2010/wordprocessingShape" mc:Ignorable="w14 w15 w16se w16cid w16 w16cex w16sdtdh w16sdtfl w16du wp14">
   <w:footnote w:type="separator" w:id="-1">
     <w:p>
       <w:r>
@@ -1181,7 +1195,7 @@
 </file>
 
 <file path=word/numbering.xml><?xml version="1.0" encoding="utf-8"?>
-<w:numbering xmlns:wpc="http://schemas.microsoft.com/office/word/2010/wordprocessingCanvas" xmlns:cx="http://schemas.microsoft.com/office/drawing/2014/chartex" xmlns:cx1="http://schemas.microsoft.com/office/drawing/2015/9/8/chartex" xmlns:cx2="http://schemas.microsoft.com/office/drawing/2015/10/21/chartex" xmlns:cx3="http://schemas.microsoft.com/office/drawing/2016/5/9/chartex" xmlns:cx4="http://schemas.microsoft.com/office/drawing/2016/5/10/chartex" xmlns:cx5="http://schemas.microsoft.com/office/drawing/2016/5/11/chartex" xmlns:cx6="http://schemas.microsoft.com/office/drawing/2016/5/12/chartex" xmlns:cx7="http://schemas.microsoft.com/office/drawing/2016/5/13/chartex" xmlns:cx8="http://schemas.microsoft.com/office/drawing/2016/5/14/chartex" xmlns:mc="http://schemas.openxmlformats.org/markup-compatibility/2006" xmlns:aink="http://schemas.microsoft.com/office/drawing/2016/ink" xmlns:am3d="http://schemas.microsoft.com/office/drawing/2017/model3d" xmlns:o="urn:schemas-microsoft-com:office:office" xmlns:oel="http://schemas.microsoft.com/office/2019/extlst" xmlns:r="http://schemas.openxmlformats.org/officeDocument/2006/relationships" xmlns:m="http://schemas.openxmlformats.org/officeDocument/2006/math" xmlns:v="urn:schemas-microsoft-com:vml" xmlns:wp14="http://schemas.microsoft.com/office/word/2010/wordprocessingDrawing" xmlns:wp="http://schemas.openxmlformats.org/drawingml/2006/wordprocessingDrawing" xmlns:w10="urn:schemas-microsoft-com:office:word" xmlns:w="http://schemas.openxmlformats.org/wordprocessingml/2006/main" xmlns:w14="http://schemas.microsoft.com/office/word/2010/wordml" xmlns:w15="http://schemas.microsoft.com/office/word/2012/wordml" xmlns:w16cex="http://schemas.microsoft.com/office/word/2018/wordml/cex" xmlns:w16cid="http://schemas.microsoft.com/office/word/2016/wordml/cid" xmlns:w16="http://schemas.microsoft.com/office/word/2018/wordml" xmlns:w16du="http://schemas.microsoft.com/office/word/2023/wordml/word16du" xmlns:w16sdtdh="http://schemas.microsoft.com/office/word/2020/wordml/sdtdatahash" xmlns:w16sdtfl="http://schemas.microsoft.com/office/word/2024/wordml/sdtformatlock" xmlns:w16se="http://schemas.microsoft.com/office/word/2015/wordml/symex" xmlns:wpg="http://schemas.microsoft.com/office/word/2010/wordprocessingGroup" xmlns:wpi="http://schemas.microsoft.com/office/word/2010/wordprocessingInk" xmlns:wne="http://schemas.microsoft.com/office/word/2006/wordml" xmlns:wps="http://schemas.microsoft.com/office/word/2010/wordprocessingShape" mc:Ignorable="w14 w15 w16se w16cid w16 w16cex w16sdtdh w16sdtfl w16du wp14">
+<w:numbering xmlns:wpc="http://schemas.microsoft.com/office/word/2010/wordprocessingCanvas" xmlns:cx="http://schemas.microsoft.com/office/drawing/2014/chartex" xmlns:cx1="http://schemas.microsoft.com/office/drawing/2015/9/8/chartex" xmlns:cx2="http://schemas.microsoft.com/office/drawing/2015/10/21/chartex" xmlns:cx3="http://schemas.microsoft.com/office/drawing/2016/5/9/chartex" xmlns:cx4="http://schemas.microsoft.com/office/drawing/2016/5/10/chartex" xmlns:cx5="http://schemas.microsoft.com/office/drawing/2016/5/11/chartex" xmlns:cx6="http://schemas.microsoft.com/office/drawing/2016/5/12/chartex" xmlns:cx7="http://schemas.microsoft.com/office/drawing/2016/5/13/chartex" xmlns:cx8="http://schemas.microsoft.com/office/drawing/2016/5/14/chartex" xmlns:mc="http://schemas.openxmlformats.org/markup-compatibility/2006" xmlns:aink="http://schemas.microsoft.com/office/drawing/2016/ink" xmlns:am3d="http://schemas.microsoft.com/office/drawing/2017/model3d" xmlns:o="urn:schemas-microsoft-com:office:office" xmlns:oel="http://schemas.microsoft.com/office/2019/extlst" xmlns:r="http://schemas.openxmlformats.org/officeDocument/2006/relationships" xmlns:m="http://schemas.openxmlformats.org/officeDocument/2006/math" xmlns:v="urn:schemas-microsoft-com:vml" xmlns:wp14="http://schemas.microsoft.com/office/word/2010/wordprocessingDrawing" xmlns:wp="http://schemas.openxmlformats.org/drawingml/2006/wordprocessingDrawing" xmlns:w10="urn:schemas-microsoft-com:office:word" xmlns:w="http://schemas.openxmlformats.org/wordprocessingml/2006/main" xmlns:w14="http://schemas.microsoft.com/office/word/2010/wordml" xmlns:w15="http://schemas.microsoft.com/office/word/2012/wordml" xmlns:w16cei="http://schemas.microsoft.com/office/word/2026/wordml/cei" xmlns:w16cex="http://schemas.microsoft.com/office/word/2018/wordml/cex" xmlns:w16cid="http://schemas.microsoft.com/office/word/2016/wordml/cid" xmlns:w16="http://schemas.microsoft.com/office/word/2018/wordml" xmlns:w16du="http://schemas.microsoft.com/office/word/2023/wordml/word16du" xmlns:w16sdtdh="http://schemas.microsoft.com/office/word/2020/wordml/sdtdatahash" xmlns:w16sdtfl="http://schemas.microsoft.com/office/word/2024/wordml/sdtformatlock" xmlns:w16se="http://schemas.microsoft.com/office/word/2015/wordml/symex" xmlns:wpg="http://schemas.microsoft.com/office/word/2010/wordprocessingGroup" xmlns:wpi="http://schemas.microsoft.com/office/word/2010/wordprocessingInk" xmlns:wne="http://schemas.microsoft.com/office/word/2006/wordml" xmlns:wps="http://schemas.microsoft.com/office/word/2010/wordprocessingShape" mc:Ignorable="w14 w15 w16se w16cid w16 w16cex w16sdtdh w16sdtfl w16du wp14">
   <w:abstractNum w:abstractNumId="0" w15:restartNumberingAfterBreak="0">
     <w:nsid w:val="0000A991"/>
     <w:multiLevelType w:val="multilevel"/>
@@ -1263,6 +1277,118 @@
     </w:lvl>
   </w:abstractNum>
   <w:abstractNum w:abstractNumId="1" w15:restartNumberingAfterBreak="0">
+    <w:nsid w:val="0B904F6C"/>
+    <w:multiLevelType w:val="hybridMultilevel"/>
+    <w:tmpl w:val="8EF03AB8"/>
+    <w:lvl w:ilvl="0" w:tplc="9EBE6B52">
+      <w:numFmt w:val="bullet"/>
+      <w:lvlText w:val="–"/>
+      <w:lvlJc w:val="left"/>
+      <w:pPr>
+        <w:ind w:left="720" w:hanging="360"/>
+      </w:pPr>
+      <w:rPr>
+        <w:rFonts w:ascii="Open Sans" w:eastAsiaTheme="minorHAnsi" w:hAnsi="Open Sans" w:cs="Open Sans" w:hint="default"/>
+      </w:rPr>
+    </w:lvl>
+    <w:lvl w:ilvl="1" w:tplc="08090003" w:tentative="1">
+      <w:start w:val="1"/>
+      <w:numFmt w:val="bullet"/>
+      <w:lvlText w:val="o"/>
+      <w:lvlJc w:val="left"/>
+      <w:pPr>
+        <w:ind w:left="1440" w:hanging="360"/>
+      </w:pPr>
+      <w:rPr>
+        <w:rFonts w:ascii="Courier New" w:hAnsi="Courier New" w:cs="Courier New" w:hint="default"/>
+      </w:rPr>
+    </w:lvl>
+    <w:lvl w:ilvl="2" w:tplc="08090005" w:tentative="1">
+      <w:start w:val="1"/>
+      <w:numFmt w:val="bullet"/>
+      <w:lvlText w:val=""/>
+      <w:lvlJc w:val="left"/>
+      <w:pPr>
+        <w:ind w:left="2160" w:hanging="360"/>
+      </w:pPr>
+      <w:rPr>
+        <w:rFonts w:ascii="Wingdings" w:hAnsi="Wingdings" w:hint="default"/>
+      </w:rPr>
+    </w:lvl>
+    <w:lvl w:ilvl="3" w:tplc="08090001" w:tentative="1">
+      <w:start w:val="1"/>
+      <w:numFmt w:val="bullet"/>
+      <w:lvlText w:val=""/>
+      <w:lvlJc w:val="left"/>
+      <w:pPr>
+        <w:ind w:left="2880" w:hanging="360"/>
+      </w:pPr>
+      <w:rPr>
+        <w:rFonts w:ascii="Symbol" w:hAnsi="Symbol" w:hint="default"/>
+      </w:rPr>
+    </w:lvl>
+    <w:lvl w:ilvl="4" w:tplc="08090003" w:tentative="1">
+      <w:start w:val="1"/>
+      <w:numFmt w:val="bullet"/>
+      <w:lvlText w:val="o"/>
+      <w:lvlJc w:val="left"/>
+      <w:pPr>
+        <w:ind w:left="3600" w:hanging="360"/>
+      </w:pPr>
+      <w:rPr>
+        <w:rFonts w:ascii="Courier New" w:hAnsi="Courier New" w:cs="Courier New" w:hint="default"/>
+      </w:rPr>
+    </w:lvl>
+    <w:lvl w:ilvl="5" w:tplc="08090005" w:tentative="1">
+      <w:start w:val="1"/>
+      <w:numFmt w:val="bullet"/>
+      <w:lvlText w:val=""/>
+      <w:lvlJc w:val="left"/>
+      <w:pPr>
+        <w:ind w:left="4320" w:hanging="360"/>
+      </w:pPr>
+      <w:rPr>
+        <w:rFonts w:ascii="Wingdings" w:hAnsi="Wingdings" w:hint="default"/>
+      </w:rPr>
+    </w:lvl>
+    <w:lvl w:ilvl="6" w:tplc="08090001" w:tentative="1">
+      <w:start w:val="1"/>
+      <w:numFmt w:val="bullet"/>
+      <w:lvlText w:val=""/>
+      <w:lvlJc w:val="left"/>
+      <w:pPr>
+        <w:ind w:left="5040" w:hanging="360"/>
+      </w:pPr>
+      <w:rPr>
+        <w:rFonts w:ascii="Symbol" w:hAnsi="Symbol" w:hint="default"/>
+      </w:rPr>
+    </w:lvl>
+    <w:lvl w:ilvl="7" w:tplc="08090003" w:tentative="1">
+      <w:start w:val="1"/>
+      <w:numFmt w:val="bullet"/>
+      <w:lvlText w:val="o"/>
+      <w:lvlJc w:val="left"/>
+      <w:pPr>
+        <w:ind w:left="5760" w:hanging="360"/>
+      </w:pPr>
+      <w:rPr>
+        <w:rFonts w:ascii="Courier New" w:hAnsi="Courier New" w:cs="Courier New" w:hint="default"/>
+      </w:rPr>
+    </w:lvl>
+    <w:lvl w:ilvl="8" w:tplc="08090005" w:tentative="1">
+      <w:start w:val="1"/>
+      <w:numFmt w:val="bullet"/>
+      <w:lvlText w:val=""/>
+      <w:lvlJc w:val="left"/>
+      <w:pPr>
+        <w:ind w:left="6480" w:hanging="360"/>
+      </w:pPr>
+      <w:rPr>
+        <w:rFonts w:ascii="Wingdings" w:hAnsi="Wingdings" w:hint="default"/>
+      </w:rPr>
+    </w:lvl>
+  </w:abstractNum>
+  <w:abstractNum w:abstractNumId="2" w15:restartNumberingAfterBreak="0">
     <w:nsid w:val="26606A6E"/>
     <w:multiLevelType w:val="multilevel"/>
     <w:tmpl w:val="4D3C5B62"/>
@@ -1371,7 +1497,7 @@
       </w:pPr>
     </w:lvl>
   </w:abstractNum>
-  <w:abstractNum w:abstractNumId="2" w15:restartNumberingAfterBreak="0">
+  <w:abstractNum w:abstractNumId="3" w15:restartNumberingAfterBreak="0">
     <w:nsid w:val="493B2628"/>
     <w:multiLevelType w:val="multilevel"/>
     <w:tmpl w:val="D59E99AC"/>
@@ -1478,7 +1604,7 @@
       </w:pPr>
     </w:lvl>
   </w:abstractNum>
-  <w:abstractNum w:abstractNumId="3" w15:restartNumberingAfterBreak="0">
+  <w:abstractNum w:abstractNumId="4" w15:restartNumberingAfterBreak="0">
     <w:nsid w:val="49410109"/>
     <w:multiLevelType w:val="hybridMultilevel"/>
     <w:tmpl w:val="62C8ECB6"/>
@@ -1565,7 +1691,7 @@
       </w:pPr>
     </w:lvl>
   </w:abstractNum>
-  <w:abstractNum w:abstractNumId="4" w15:restartNumberingAfterBreak="0">
+  <w:abstractNum w:abstractNumId="5" w15:restartNumberingAfterBreak="0">
     <w:nsid w:val="4B041A64"/>
     <w:multiLevelType w:val="hybridMultilevel"/>
     <w:tmpl w:val="BB66C3D2"/>
@@ -1653,19 +1779,22 @@
     </w:lvl>
   </w:abstractNum>
   <w:num w:numId="1" w16cid:durableId="373889245">
-    <w:abstractNumId w:val="1"/>
+    <w:abstractNumId w:val="2"/>
   </w:num>
   <w:num w:numId="2" w16cid:durableId="653340123">
-    <w:abstractNumId w:val="2"/>
+    <w:abstractNumId w:val="3"/>
   </w:num>
   <w:num w:numId="3" w16cid:durableId="1463116424">
-    <w:abstractNumId w:val="4"/>
+    <w:abstractNumId w:val="5"/>
   </w:num>
   <w:num w:numId="4" w16cid:durableId="1158153321">
-    <w:abstractNumId w:val="3"/>
+    <w:abstractNumId w:val="4"/>
   </w:num>
   <w:num w:numId="5" w16cid:durableId="1590121011">
     <w:abstractNumId w:val="0"/>
+  </w:num>
+  <w:num w:numId="6" w16cid:durableId="980353052">
+    <w:abstractNumId w:val="1"/>
   </w:num>
   <w:numIdMacAtCleanup w:val="5"/>
 </w:numbering>
@@ -3078,6 +3207,22 @@
       <w:spacing w:val="5"/>
     </w:rPr>
   </w:style>
+  <w:style w:type="paragraph" w:customStyle="1" w:styleId="CommentsList">
+    <w:name w:val="Comments List"/>
+    <w:qFormat/>
+    <w:rsid w:val="00764288"/>
+    <w:pPr>
+      <w:numPr>
+        <w:numId w:val="6"/>
+      </w:numPr>
+      <w:ind w:left="567"/>
+    </w:pPr>
+    <w:rPr>
+      <w:i/>
+      <w:iCs/>
+      <w:color w:val="A6A6A6" w:themeColor="background1" w:themeShade="A6"/>
+    </w:rPr>
+  </w:style>
 </w:styles>
 </file>
 
@@ -3377,7 +3522,14 @@
 </file>
 
 <file path=customXml/item1.xml><?xml version="1.0" encoding="utf-8"?>
-<b:Sources xmlns:b="http://schemas.openxmlformats.org/officeDocument/2006/bibliography" xmlns="http://schemas.openxmlformats.org/officeDocument/2006/bibliography" SelectedStyle="\APASixthEditionOfficeOnline.xsl" StyleName="APA" Version="6"/>
+<p:properties xmlns:p="http://schemas.microsoft.com/office/2006/metadata/properties" xmlns:xsi="http://www.w3.org/2001/XMLSchema-instance" xmlns:pc="http://schemas.microsoft.com/office/infopath/2007/PartnerControls">
+  <documentManagement>
+    <TaxCatchAll xmlns="585e1850-a672-4c59-9766-e6f9b47acd25" xsi:nil="true"/>
+    <lcf76f155ced4ddcb4097134ff3c332f xmlns="c94c4ac8-faf4-477a-b4e6-6adaeda6e30a">
+      <Terms xmlns="http://schemas.microsoft.com/office/infopath/2007/PartnerControls"/>
+    </lcf76f155ced4ddcb4097134ff3c332f>
+  </documentManagement>
+</p:properties>
 </file>
 
 <file path=customXml/item2.xml><?xml version="1.0" encoding="utf-8"?>
@@ -3582,14 +3734,7 @@
 </file>
 
 <file path=customXml/item3.xml><?xml version="1.0" encoding="utf-8"?>
-<p:properties xmlns:p="http://schemas.microsoft.com/office/2006/metadata/properties" xmlns:xsi="http://www.w3.org/2001/XMLSchema-instance" xmlns:pc="http://schemas.microsoft.com/office/infopath/2007/PartnerControls">
-  <documentManagement>
-    <TaxCatchAll xmlns="585e1850-a672-4c59-9766-e6f9b47acd25" xsi:nil="true"/>
-    <lcf76f155ced4ddcb4097134ff3c332f xmlns="c94c4ac8-faf4-477a-b4e6-6adaeda6e30a">
-      <Terms xmlns="http://schemas.microsoft.com/office/infopath/2007/PartnerControls"/>
-    </lcf76f155ced4ddcb4097134ff3c332f>
-  </documentManagement>
-</p:properties>
+<b:Sources xmlns:b="http://schemas.openxmlformats.org/officeDocument/2006/bibliography" xmlns="http://schemas.openxmlformats.org/officeDocument/2006/bibliography" SelectedStyle="\APASixthEditionOfficeOnline.xsl" StyleName="APA" Version="6"/>
 </file>
 
 <file path=customXml/item4.xml><?xml version="1.0" encoding="utf-8"?>
@@ -3602,24 +3747,39 @@
 </file>
 
 <file path=customXml/itemProps1.xml><?xml version="1.0" encoding="utf-8"?>
-<ds:datastoreItem xmlns:ds="http://schemas.openxmlformats.org/officeDocument/2006/customXml" ds:itemID="{668116DB-449A-4CE7-A420-71D80D1FD4D0}">
-  <ds:schemaRefs>
-    <ds:schemaRef ds:uri="http://schemas.openxmlformats.org/officeDocument/2006/bibliography"/>
-  </ds:schemaRefs>
-</ds:datastoreItem>
-</file>
-
-<file path=customXml/itemProps2.xml><?xml version="1.0" encoding="utf-8"?>
-<ds:datastoreItem xmlns:ds="http://schemas.openxmlformats.org/officeDocument/2006/customXml" ds:itemID="{7919177A-178C-477A-B66B-9551FE46CEB4}"/>
-</file>
-
-<file path=customXml/itemProps3.xml><?xml version="1.0" encoding="utf-8"?>
 <ds:datastoreItem xmlns:ds="http://schemas.openxmlformats.org/officeDocument/2006/customXml" ds:itemID="{D33B220A-E5F1-45CA-BD7E-6DCC0E9AEEE0}">
   <ds:schemaRefs>
     <ds:schemaRef ds:uri="http://schemas.microsoft.com/office/2006/metadata/properties"/>
     <ds:schemaRef ds:uri="http://schemas.microsoft.com/office/infopath/2007/PartnerControls"/>
     <ds:schemaRef ds:uri="585e1850-a672-4c59-9766-e6f9b47acd25"/>
     <ds:schemaRef ds:uri="c94c4ac8-faf4-477a-b4e6-6adaeda6e30a"/>
+  </ds:schemaRefs>
+</ds:datastoreItem>
+</file>
+
+<file path=customXml/itemProps2.xml><?xml version="1.0" encoding="utf-8"?>
+<ds:datastoreItem xmlns:ds="http://schemas.openxmlformats.org/officeDocument/2006/customXml" ds:itemID="{7919177A-178C-477A-B66B-9551FE46CEB4}">
+  <ds:schemaRefs>
+    <ds:schemaRef ds:uri="http://schemas.microsoft.com/office/2006/metadata/contentType"/>
+    <ds:schemaRef ds:uri="http://schemas.microsoft.com/office/2006/metadata/properties/metaAttributes"/>
+    <ds:schemaRef ds:uri="http://www.w3.org/2001/XMLSchema"/>
+    <ds:schemaRef ds:uri="http://schemas.microsoft.com/office/2006/metadata/properties"/>
+    <ds:schemaRef ds:uri="c94c4ac8-faf4-477a-b4e6-6adaeda6e30a"/>
+    <ds:schemaRef ds:uri="585e1850-a672-4c59-9766-e6f9b47acd25"/>
+    <ds:schemaRef ds:uri="http://schemas.microsoft.com/office/2006/documentManagement/types"/>
+    <ds:schemaRef ds:uri="http://schemas.microsoft.com/office/infopath/2007/PartnerControls"/>
+    <ds:schemaRef ds:uri="http://schemas.openxmlformats.org/package/2006/metadata/core-properties"/>
+    <ds:schemaRef ds:uri="http://purl.org/dc/elements/1.1/"/>
+    <ds:schemaRef ds:uri="http://purl.org/dc/terms/"/>
+    <ds:schemaRef ds:uri="http://schemas.microsoft.com/internal/obd"/>
+  </ds:schemaRefs>
+</ds:datastoreItem>
+</file>
+
+<file path=customXml/itemProps3.xml><?xml version="1.0" encoding="utf-8"?>
+<ds:datastoreItem xmlns:ds="http://schemas.openxmlformats.org/officeDocument/2006/customXml" ds:itemID="{668116DB-449A-4CE7-A420-71D80D1FD4D0}">
+  <ds:schemaRefs>
+    <ds:schemaRef ds:uri="http://schemas.openxmlformats.org/officeDocument/2006/bibliography"/>
   </ds:schemaRefs>
 </ds:datastoreItem>
 </file>

</xml_diff>